<commit_message>
Add Results docx (KR/EN) with Tables 1-3 and Figure 2; update Figure 1
Results section with native Word tables (three-line style, fixed column
widths, each table on its own page) and Figure 2, in Korean and English.
Figure 1 now shows covariates in a box below the model; the note and
Methods 2.2.4 state that covariates entered the mediator and outcome
models, which is how PROCESS Model 4 applies them.

Co-Authored-By: Claude Opus 5.5 <noreply@anthropic.com>
Claude-Session: https://claude.ai/code/session_012HCLm1nEEKtVYYR1vZyojs
</commit_message>
<xml_diff>
--- a/manuscript/Methods_KR_2026-10-12.docx
+++ b/manuscript/Methods_KR_2026-10-12.docx
@@ -313,7 +313,7 @@
       <w:r>
         <w:drawing>
           <wp:inline xmlns:a="http://schemas.openxmlformats.org/drawingml/2006/main" xmlns:pic="http://schemas.openxmlformats.org/drawingml/2006/picture">
-            <wp:extent cx="5580000" cy="2232000"/>
+            <wp:extent cx="5580000" cy="2728000"/>
             <wp:docPr id="1" name="Picture 1"/>
             <wp:cNvGraphicFramePr>
               <a:graphicFrameLocks noChangeAspect="1"/>
@@ -322,7 +322,7 @@
               <a:graphicData uri="http://schemas.openxmlformats.org/drawingml/2006/picture">
                 <pic:pic>
                   <pic:nvPicPr>
-                    <pic:cNvPr id="0" name="figure1.png"/>
+                    <pic:cNvPr id="0" name="Figure1_kr.png"/>
                     <pic:cNvPicPr/>
                   </pic:nvPicPr>
                   <pic:blipFill>
@@ -334,7 +334,7 @@
                   <pic:spPr>
                     <a:xfrm>
                       <a:off x="0" y="0"/>
-                      <a:ext cx="5580000" cy="2232000"/>
+                      <a:ext cx="5580000" cy="2728000"/>
                     </a:xfrm>
                     <a:prstGeom prst="rect"/>
                   </pic:spPr>
@@ -392,7 +392,7 @@
           <w:i w:val="0"/>
           <w:sz w:val="20"/>
         </w:rPr>
-        <w:t xml:space="preserve"> von Wagner 등(2009)의 건강문해력과 건강행위 틀을 수정함. 실선은 검증한 경로(</w:t>
+        <w:t xml:space="preserve"> von Wagner 등(2009)의 건강문해력과 건강행위 틀을 수정함. </w:t>
       </w:r>
       <w:r>
         <w:rPr>
@@ -446,7 +446,7 @@
           <w:i w:val="0"/>
           <w:sz w:val="20"/>
         </w:rPr>
-        <w:t>′), 점선은 공변량을 투입한 모형(Model 2)에서 보정한 변수를 나타냄.</w:t>
+        <w:t>′는 검증한 경로임. 점선 상자의 공변량은 공변량을 투입한 모형(Model 2)에서 매개변수(통증 개념 지식)와 결과변수(신체활동 자기조절)의 회귀모형에 투입함.</w:t>
       </w:r>
     </w:p>
     <w:p>
@@ -679,7 +679,7 @@
           <w:i w:val="0"/>
           <w:sz w:val="22"/>
         </w:rPr>
-        <w:t>의사소통 건강문해력과 신체활동 자기조절 간 관계에서 통증 개념 지식의 매개효과를 확인하기 위하여 Hayes (2022)가 제안한 PROCESS macro 모형 4를 적용한 매개분석을 실시하였다. 공변량을 투입하지 않은 모형(Model 1)과 성별, 연령, 지난 6개월간 통증 빈도를 공변량으로 투입한 모형(Model 2)을 각각 분석하였다. 성별과 통증 빈도는 더미변수로 변환하여 투입하였으며, 통증 빈도는 '3개월 미만'을 기준범주로 하였다. 간접효과의 통계적 유의성을 검증하기 위해 5,000회 부트스트래핑(bootstrapping)을 시행하였고, 백분위수(percentile) 95% 신뢰구간에 0이 포함되지 않을 때 통계적으로 유의한 것으로 판단하였다. 통계적 유의수준은 .05로 하였다.</w:t>
+        <w:t>의사소통 건강문해력과 신체활동 자기조절 간 관계에서 통증 개념 지식의 매개효과를 확인하기 위하여 Hayes (2022)가 제안한 PROCESS macro 모형 4를 적용한 매개분석을 실시하였다. 공변량을 투입하지 않은 모형(Model 1)과 성별, 연령, 지난 6개월간 통증 빈도를 공변량으로 투입한 모형(Model 2)을 각각 분석하였다. 성별과 통증 빈도는 더미변수로 변환하여 투입하였으며, 통증 빈도는 '3개월 미만'을 기준범주로 하였다. 공변량은 매개변수와 결과변수를 예측하는 회귀모형에 각각 투입하였다. 간접효과의 통계적 유의성을 검증하기 위해 5,000회 부트스트래핑(bootstrapping)을 시행하였고, 백분위수(percentile) 95% 신뢰구간에 0이 포함되지 않을 때 통계적으로 유의한 것으로 판단하였다. 통계적 유의수준은 .05로 하였다.</w:t>
       </w:r>
     </w:p>
     <w:sectPr>

</xml_diff>

<commit_message>
Make Figures 1 and 2 editable Word shapes instead of images
Figures are now inline groups of rectangles, arrows and text boxes, so the
labels and coefficients can be edited directly in Word. PNG copies remain
for journals that require separate figure files.

Co-Authored-By: Claude Opus 5.5 <noreply@anthropic.com>
Claude-Session: https://claude.ai/code/session_012HCLm1nEEKtVYYR1vZyojs
</commit_message>
<xml_diff>
--- a/manuscript/Methods_KR_2026-10-12.docx
+++ b/manuscript/Methods_KR_2026-10-12.docx
@@ -310,39 +310,433 @@
         <w:spacing w:before="240" w:after="80"/>
         <w:jc w:val="center"/>
       </w:pPr>
-      <w:r>
-        <w:drawing>
-          <wp:inline xmlns:a="http://schemas.openxmlformats.org/drawingml/2006/main" xmlns:pic="http://schemas.openxmlformats.org/drawingml/2006/picture">
-            <wp:extent cx="5580000" cy="2728000"/>
-            <wp:docPr id="1" name="Picture 1"/>
-            <wp:cNvGraphicFramePr>
-              <a:graphicFrameLocks noChangeAspect="1"/>
-            </wp:cNvGraphicFramePr>
-            <a:graphic>
-              <a:graphicData uri="http://schemas.openxmlformats.org/drawingml/2006/picture">
-                <pic:pic>
-                  <pic:nvPicPr>
-                    <pic:cNvPr id="0" name="Figure1_kr.png"/>
-                    <pic:cNvPicPr/>
-                  </pic:nvPicPr>
-                  <pic:blipFill>
-                    <a:blip r:embed="rId9"/>
-                    <a:stretch>
-                      <a:fillRect/>
-                    </a:stretch>
-                  </pic:blipFill>
-                  <pic:spPr>
-                    <a:xfrm>
-                      <a:off x="0" y="0"/>
-                      <a:ext cx="5580000" cy="2728000"/>
-                    </a:xfrm>
-                    <a:prstGeom prst="rect"/>
-                  </pic:spPr>
-                </pic:pic>
-              </a:graphicData>
-            </a:graphic>
-          </wp:inline>
-        </w:drawing>
+      <w:r xmlns:a="http://schemas.openxmlformats.org/drawingml/2006/main">
+        <mc:AlternateContent>
+          <mc:Choice Requires="wpg">
+            <w:drawing>
+              <wp:inline distT="0" distB="0" distL="0" distR="0">
+                <wp:extent cx="5580000" cy="2790000"/>
+                <wp:effectExtent l="0" t="0" r="0" b="0"/>
+                <wp:docPr id="511" name="Figure 1"/>
+                <wp:cNvGraphicFramePr/>
+                <a:graphic>
+                  <a:graphicData uri="http://schemas.microsoft.com/office/word/2010/wordprocessingGroup">
+                    <wpg:wgp>
+                      <wpg:cNvGrpSpPr/>
+                      <wpg:grpSpPr>
+                        <a:xfrm>
+                          <a:off x="0" y="0"/>
+                          <a:ext cx="5580000" cy="2790000"/>
+                          <a:chOff x="0" y="0"/>
+                          <a:chExt cx="5580000" cy="2790000"/>
+                        </a:xfrm>
+                      </wpg:grpSpPr>
+                      <wps:wsp>
+                        <wps:cNvPr id="501" name="Text 501"/>
+                        <wps:cNvSpPr txBox="1"/>
+                        <wps:spPr>
+                          <a:xfrm>
+                            <a:off x="62000" y="1550000"/>
+                            <a:ext cx="1798000" cy="496000"/>
+                          </a:xfrm>
+                          <a:prstGeom prst="rect">
+                            <a:avLst/>
+                          </a:prstGeom>
+                          <a:solidFill>
+                            <a:srgbClr val="FFFFFF"/>
+                          </a:solidFill>
+                          <a:ln w="19050">
+                            <a:solidFill>
+                              <a:srgbClr val="000000"/>
+                            </a:solidFill>
+                          </a:ln>
+                        </wps:spPr>
+                        <wps:txbx>
+                          <w:txbxContent>
+                            <w:p>
+                              <w:pPr>
+                                <w:spacing w:before="0" w:after="0" w:line="240" w:lineRule="auto"/>
+                                <w:jc w:val="center"/>
+                              </w:pPr>
+                              <w:r>
+                                <w:rPr>
+                                  <w:rFonts w:ascii="Times New Roman" w:hAnsi="Times New Roman" w:cs="Times New Roman" w:eastAsia="바탕"/>
+                                  <w:b/>
+                                  <w:sz w:val="20"/>
+                                  <w:szCs w:val="20"/>
+                                </w:rPr>
+                                <w:t xml:space="preserve">의사소통 건강문해력</w:t>
+                              </w:r>
+                            </w:p>
+                            <w:p>
+                              <w:pPr>
+                                <w:spacing w:before="0" w:after="0" w:line="240" w:lineRule="auto"/>
+                                <w:jc w:val="center"/>
+                              </w:pPr>
+                              <w:r>
+                                <w:rPr>
+                                  <w:rFonts w:ascii="Times New Roman" w:hAnsi="Times New Roman" w:cs="Times New Roman" w:eastAsia="바탕"/>
+                                  <w:sz w:val="16"/>
+                                  <w:szCs w:val="16"/>
+                                </w:rPr>
+                                <w:t xml:space="preserve">(환자–의료제공자 의사소통)</w:t>
+                              </w:r>
+                            </w:p>
+                          </w:txbxContent>
+                        </wps:txbx>
+                        <wps:bodyPr rot="0" vert="horz" wrap="square" lIns="36000" tIns="18000" rIns="36000" bIns="18000" anchor="ctr" anchorCtr="0">
+                          <a:noAutofit/>
+                        </wps:bodyPr>
+                      </wps:wsp>
+                      <wps:wsp>
+                        <wps:cNvPr id="502" name="Text 502"/>
+                        <wps:cNvSpPr txBox="1"/>
+                        <wps:spPr>
+                          <a:xfrm>
+                            <a:off x="1891000" y="248000"/>
+                            <a:ext cx="1798000" cy="496000"/>
+                          </a:xfrm>
+                          <a:prstGeom prst="rect">
+                            <a:avLst/>
+                          </a:prstGeom>
+                          <a:solidFill>
+                            <a:srgbClr val="FFFFFF"/>
+                          </a:solidFill>
+                          <a:ln w="19050">
+                            <a:solidFill>
+                              <a:srgbClr val="000000"/>
+                            </a:solidFill>
+                          </a:ln>
+                        </wps:spPr>
+                        <wps:txbx>
+                          <w:txbxContent>
+                            <w:p>
+                              <w:pPr>
+                                <w:spacing w:before="0" w:after="0" w:line="240" w:lineRule="auto"/>
+                                <w:jc w:val="center"/>
+                              </w:pPr>
+                              <w:r>
+                                <w:rPr>
+                                  <w:rFonts w:ascii="Times New Roman" w:hAnsi="Times New Roman" w:cs="Times New Roman" w:eastAsia="바탕"/>
+                                  <w:b/>
+                                  <w:sz w:val="20"/>
+                                  <w:szCs w:val="20"/>
+                                </w:rPr>
+                                <w:t xml:space="preserve">통증 개념 지식</w:t>
+                              </w:r>
+                            </w:p>
+                            <w:p>
+                              <w:pPr>
+                                <w:spacing w:before="0" w:after="0" w:line="240" w:lineRule="auto"/>
+                                <w:jc w:val="center"/>
+                              </w:pPr>
+                              <w:r>
+                                <w:rPr>
+                                  <w:rFonts w:ascii="Times New Roman" w:hAnsi="Times New Roman" w:cs="Times New Roman" w:eastAsia="바탕"/>
+                                  <w:sz w:val="16"/>
+                                  <w:szCs w:val="16"/>
+                                </w:rPr>
+                                <w:t xml:space="preserve">(동기 요인: 지식과 신념)</w:t>
+                              </w:r>
+                            </w:p>
+                          </w:txbxContent>
+                        </wps:txbx>
+                        <wps:bodyPr rot="0" vert="horz" wrap="square" lIns="36000" tIns="18000" rIns="36000" bIns="18000" anchor="ctr" anchorCtr="0">
+                          <a:noAutofit/>
+                        </wps:bodyPr>
+                      </wps:wsp>
+                      <wps:wsp>
+                        <wps:cNvPr id="503" name="Text 503"/>
+                        <wps:cNvSpPr txBox="1"/>
+                        <wps:spPr>
+                          <a:xfrm>
+                            <a:off x="3720000" y="1550000"/>
+                            <a:ext cx="1798000" cy="496000"/>
+                          </a:xfrm>
+                          <a:prstGeom prst="rect">
+                            <a:avLst/>
+                          </a:prstGeom>
+                          <a:solidFill>
+                            <a:srgbClr val="FFFFFF"/>
+                          </a:solidFill>
+                          <a:ln w="19050">
+                            <a:solidFill>
+                              <a:srgbClr val="000000"/>
+                            </a:solidFill>
+                          </a:ln>
+                        </wps:spPr>
+                        <wps:txbx>
+                          <w:txbxContent>
+                            <w:p>
+                              <w:pPr>
+                                <w:spacing w:before="0" w:after="0" w:line="240" w:lineRule="auto"/>
+                                <w:jc w:val="center"/>
+                              </w:pPr>
+                              <w:r>
+                                <w:rPr>
+                                  <w:rFonts w:ascii="Times New Roman" w:hAnsi="Times New Roman" w:cs="Times New Roman" w:eastAsia="바탕"/>
+                                  <w:b/>
+                                  <w:sz w:val="20"/>
+                                  <w:szCs w:val="20"/>
+                                </w:rPr>
+                                <w:t xml:space="preserve">신체활동 자기조절</w:t>
+                              </w:r>
+                            </w:p>
+                            <w:p>
+                              <w:pPr>
+                                <w:spacing w:before="0" w:after="0" w:line="240" w:lineRule="auto"/>
+                                <w:jc w:val="center"/>
+                              </w:pPr>
+                              <w:r>
+                                <w:rPr>
+                                  <w:rFonts w:ascii="Times New Roman" w:hAnsi="Times New Roman" w:cs="Times New Roman" w:eastAsia="바탕"/>
+                                  <w:sz w:val="16"/>
+                                  <w:szCs w:val="16"/>
+                                </w:rPr>
+                                <w:t xml:space="preserve">(의지 요인: 자기조절)</w:t>
+                              </w:r>
+                            </w:p>
+                          </w:txbxContent>
+                        </wps:txbx>
+                        <wps:bodyPr rot="0" vert="horz" wrap="square" lIns="36000" tIns="18000" rIns="36000" bIns="18000" anchor="ctr" anchorCtr="0">
+                          <a:noAutofit/>
+                        </wps:bodyPr>
+                      </wps:wsp>
+                      <wps:wsp>
+                        <wps:cNvPr id="504" name="Text 504"/>
+                        <wps:cNvSpPr txBox="1"/>
+                        <wps:spPr>
+                          <a:xfrm>
+                            <a:off x="682000" y="2294000"/>
+                            <a:ext cx="4216000" cy="347200"/>
+                          </a:xfrm>
+                          <a:prstGeom prst="rect">
+                            <a:avLst/>
+                          </a:prstGeom>
+                          <a:solidFill>
+                            <a:srgbClr val="FFFFFF"/>
+                          </a:solidFill>
+                          <a:ln w="12700">
+                            <a:solidFill>
+                              <a:srgbClr val="000000"/>
+                            </a:solidFill>
+                            <a:prstDash val="dash"/>
+                          </a:ln>
+                        </wps:spPr>
+                        <wps:txbx>
+                          <w:txbxContent>
+                            <w:p>
+                              <w:pPr>
+                                <w:spacing w:before="0" w:after="0" w:line="240" w:lineRule="auto"/>
+                                <w:jc w:val="center"/>
+                              </w:pPr>
+                              <w:r>
+                                <w:rPr>
+                                  <w:rFonts w:ascii="Times New Roman" w:hAnsi="Times New Roman" w:cs="Times New Roman" w:eastAsia="바탕"/>
+                                  <w:sz w:val="20"/>
+                                  <w:szCs w:val="20"/>
+                                </w:rPr>
+                                <w:t xml:space="preserve">공변량: 성별, 연령, 지난 6개월간 통증 빈도</w:t>
+                              </w:r>
+                            </w:p>
+                          </w:txbxContent>
+                        </wps:txbx>
+                        <wps:bodyPr rot="0" vert="horz" wrap="square" lIns="36000" tIns="18000" rIns="36000" bIns="18000" anchor="ctr" anchorCtr="0">
+                          <a:noAutofit/>
+                        </wps:bodyPr>
+                      </wps:wsp>
+                      <wps:wsp>
+                        <wps:cNvPr id="505" name="Arrow 505"/>
+                        <wps:cNvCnPr/>
+                        <wps:spPr>
+                          <a:xfrm flipV="1">
+                            <a:off x="1178000" y="756400"/>
+                            <a:ext cx="1054000" cy="793600"/>
+                          </a:xfrm>
+                          <a:prstGeom prst="straightConnector1">
+                            <a:avLst/>
+                          </a:prstGeom>
+                          <a:ln w="19050">
+                            <a:solidFill>
+                              <a:srgbClr val="000000"/>
+                            </a:solidFill>
+                            <a:tailEnd type="triangle" w="med" len="med"/>
+                          </a:ln>
+                        </wps:spPr>
+                        <wps:bodyPr/>
+                      </wps:wsp>
+                      <wps:wsp>
+                        <wps:cNvPr id="506" name="Arrow 506"/>
+                        <wps:cNvCnPr/>
+                        <wps:spPr>
+                          <a:xfrm>
+                            <a:off x="3348000" y="756400"/>
+                            <a:ext cx="1054000" cy="781200"/>
+                          </a:xfrm>
+                          <a:prstGeom prst="straightConnector1">
+                            <a:avLst/>
+                          </a:prstGeom>
+                          <a:ln w="19050">
+                            <a:solidFill>
+                              <a:srgbClr val="000000"/>
+                            </a:solidFill>
+                            <a:tailEnd type="triangle" w="med" len="med"/>
+                          </a:ln>
+                        </wps:spPr>
+                        <wps:bodyPr/>
+                      </wps:wsp>
+                      <wps:wsp>
+                        <wps:cNvPr id="507" name="Arrow 507"/>
+                        <wps:cNvCnPr/>
+                        <wps:spPr>
+                          <a:xfrm>
+                            <a:off x="1860000" y="1798000"/>
+                            <a:ext cx="1860000" cy="0"/>
+                          </a:xfrm>
+                          <a:prstGeom prst="straightConnector1">
+                            <a:avLst/>
+                          </a:prstGeom>
+                          <a:ln w="19050">
+                            <a:solidFill>
+                              <a:srgbClr val="000000"/>
+                            </a:solidFill>
+                            <a:tailEnd type="triangle" w="med" len="med"/>
+                          </a:ln>
+                        </wps:spPr>
+                        <wps:bodyPr/>
+                      </wps:wsp>
+                      <wps:wsp>
+                        <wps:cNvPr id="508" name="Text 508"/>
+                        <wps:cNvSpPr txBox="1"/>
+                        <wps:spPr>
+                          <a:xfrm>
+                            <a:off x="1395000" y="930000"/>
+                            <a:ext cx="372000" cy="223200"/>
+                          </a:xfrm>
+                          <a:prstGeom prst="rect">
+                            <a:avLst/>
+                          </a:prstGeom>
+                          <a:noFill/>
+                          <a:ln>
+                            <a:noFill/>
+                          </a:ln>
+                        </wps:spPr>
+                        <wps:txbx>
+                          <w:txbxContent>
+                            <w:p>
+                              <w:pPr>
+                                <w:spacing w:before="0" w:after="0" w:line="240" w:lineRule="auto"/>
+                                <w:jc w:val="center"/>
+                              </w:pPr>
+                              <w:r>
+                                <w:rPr>
+                                  <w:rFonts w:ascii="Times New Roman" w:hAnsi="Times New Roman" w:cs="Times New Roman" w:eastAsia="바탕"/>
+                                  <w:i/>
+                                  <w:sz w:val="24"/>
+                                  <w:szCs w:val="24"/>
+                                </w:rPr>
+                                <w:t xml:space="preserve">a</w:t>
+                              </w:r>
+                            </w:p>
+                          </w:txbxContent>
+                        </wps:txbx>
+                        <wps:bodyPr rot="0" vert="horz" wrap="square" lIns="36000" tIns="18000" rIns="36000" bIns="18000" anchor="ctr" anchorCtr="0">
+                          <a:noAutofit/>
+                        </wps:bodyPr>
+                      </wps:wsp>
+                      <wps:wsp>
+                        <wps:cNvPr id="509" name="Text 509"/>
+                        <wps:cNvSpPr txBox="1"/>
+                        <wps:spPr>
+                          <a:xfrm>
+                            <a:off x="3813000" y="930000"/>
+                            <a:ext cx="372000" cy="223200"/>
+                          </a:xfrm>
+                          <a:prstGeom prst="rect">
+                            <a:avLst/>
+                          </a:prstGeom>
+                          <a:noFill/>
+                          <a:ln>
+                            <a:noFill/>
+                          </a:ln>
+                        </wps:spPr>
+                        <wps:txbx>
+                          <w:txbxContent>
+                            <w:p>
+                              <w:pPr>
+                                <w:spacing w:before="0" w:after="0" w:line="240" w:lineRule="auto"/>
+                                <w:jc w:val="center"/>
+                              </w:pPr>
+                              <w:r>
+                                <w:rPr>
+                                  <w:rFonts w:ascii="Times New Roman" w:hAnsi="Times New Roman" w:cs="Times New Roman" w:eastAsia="바탕"/>
+                                  <w:i/>
+                                  <w:sz w:val="24"/>
+                                  <w:szCs w:val="24"/>
+                                </w:rPr>
+                                <w:t xml:space="preserve">b</w:t>
+                              </w:r>
+                            </w:p>
+                          </w:txbxContent>
+                        </wps:txbx>
+                        <wps:bodyPr rot="0" vert="horz" wrap="square" lIns="36000" tIns="18000" rIns="36000" bIns="18000" anchor="ctr" anchorCtr="0">
+                          <a:noAutofit/>
+                        </wps:bodyPr>
+                      </wps:wsp>
+                      <wps:wsp>
+                        <wps:cNvPr id="510" name="Text 510"/>
+                        <wps:cNvSpPr txBox="1"/>
+                        <wps:spPr>
+                          <a:xfrm>
+                            <a:off x="2573000" y="1562400"/>
+                            <a:ext cx="434000" cy="210800"/>
+                          </a:xfrm>
+                          <a:prstGeom prst="rect">
+                            <a:avLst/>
+                          </a:prstGeom>
+                          <a:noFill/>
+                          <a:ln>
+                            <a:noFill/>
+                          </a:ln>
+                        </wps:spPr>
+                        <wps:txbx>
+                          <w:txbxContent>
+                            <w:p>
+                              <w:pPr>
+                                <w:spacing w:before="0" w:after="0" w:line="240" w:lineRule="auto"/>
+                                <w:jc w:val="center"/>
+                              </w:pPr>
+                              <w:r>
+                                <w:rPr>
+                                  <w:rFonts w:ascii="Times New Roman" w:hAnsi="Times New Roman" w:cs="Times New Roman" w:eastAsia="바탕"/>
+                                  <w:i/>
+                                  <w:sz w:val="24"/>
+                                  <w:szCs w:val="24"/>
+                                </w:rPr>
+                                <w:t xml:space="preserve">c</w:t>
+                              </w:r>
+                              <w:r>
+                                <w:rPr>
+                                  <w:rFonts w:ascii="Times New Roman" w:hAnsi="Times New Roman" w:cs="Times New Roman" w:eastAsia="바탕"/>
+                                  <w:sz w:val="24"/>
+                                  <w:szCs w:val="24"/>
+                                </w:rPr>
+                                <w:t xml:space="preserve">′</w:t>
+                              </w:r>
+                            </w:p>
+                          </w:txbxContent>
+                        </wps:txbx>
+                        <wps:bodyPr rot="0" vert="horz" wrap="square" lIns="36000" tIns="18000" rIns="36000" bIns="18000" anchor="ctr" anchorCtr="0">
+                          <a:noAutofit/>
+                        </wps:bodyPr>
+                      </wps:wsp>
+                    </wpg:wgp>
+                  </a:graphicData>
+                </a:graphic>
+              </wp:inline>
+            </w:drawing>
+          </mc:Choice>
+        </mc:AlternateContent>
       </w:r>
     </w:p>
     <w:p>

</xml_diff>